<commit_message>
fix: corregir cuatro rutas de archivo de la tabla de modulos
La pasada de acentuacion habia escrito TermometroEngine.kt, Estadisticas.kt,
ActividadTermometro.kt y PantallaEstadisticas.kt con tilde, convirtiendolas en
rutas inexistentes. Se validan ahora las 70 rutas contra el repositorio.

Co-Authored-By: Claude Opus 5 <noreply@anthropic.com>
</commit_message>
<xml_diff>
--- a/deliverables/Memoria_Descriptiva_SocialKids.docx
+++ b/deliverables/Memoria_Descriptiva_SocialKids.docx
@@ -12999,7 +12999,7 @@
                 <w:sz w:val="17"/>
                 <w:rFonts w:ascii="Consolas" w:hAnsi="Consolas" w:cs="Consolas"/>
               </w:rPr>
-              <w:t>domain/engine/TermómetroEngine.kt</w:t>
+              <w:t>domain/engine/TermometroEngine.kt</w:t>
             </w:r>
           </w:p>
         </w:tc>
@@ -13116,7 +13116,7 @@
                 <w:sz w:val="17"/>
                 <w:rFonts w:ascii="Consolas" w:hAnsi="Consolas" w:cs="Consolas"/>
               </w:rPr>
-              <w:t>domain/usecase/Estadísticas.kt</w:t>
+              <w:t>domain/usecase/Estadisticas.kt</w:t>
             </w:r>
           </w:p>
         </w:tc>
@@ -14091,7 +14091,7 @@
                 <w:sz w:val="17"/>
                 <w:rFonts w:ascii="Consolas" w:hAnsi="Consolas" w:cs="Consolas"/>
               </w:rPr>
-              <w:t>ui/screens/ActividadTermómetro.kt</w:t>
+              <w:t>ui/screens/ActividadTermometro.kt</w:t>
             </w:r>
           </w:p>
         </w:tc>
@@ -14247,7 +14247,7 @@
                 <w:sz w:val="17"/>
                 <w:rFonts w:ascii="Consolas" w:hAnsi="Consolas" w:cs="Consolas"/>
               </w:rPr>
-              <w:t>ui/screens/PantallaEstadísticas.kt</w:t>
+              <w:t>ui/screens/PantallaEstadisticas.kt</w:t>
             </w:r>
           </w:p>
         </w:tc>

</xml_diff>